<commit_message>
update: resume with project descriptions
</commit_message>
<xml_diff>
--- a/public/Abhiram_Lanka_Resume.docx
+++ b/public/Abhiram_Lanka_Resume.docx
@@ -755,6 +755,20 @@
     </w:p>
     <w:p>
       <w:pPr>
+        <w:spacing w:after="14" w:before="0"/>
+      </w:pPr>
+      <w:r>
+        <w:rPr>
+          <w:rFonts w:ascii="Calibri" w:cs="Calibri" w:eastAsia="Calibri" w:hAnsi="Calibri"/>
+          <w:color w:val="3a3a3a"/>
+          <w:sz w:val="19"/>
+          <w:szCs w:val="19"/>
+        </w:rPr>
+        <w:t xml:space="preserve">Most city bus routes in India have no live tracking — not because the tech doesn't exist, but because dedicated GPS hardware costs ₹15,000 per vehicle. CityBus Live eliminates this by repurposing the driver's own smartphone as the tracker, delivering real-time ETAs to commuters via a PWA at zero hardware cost.</w:t>
+      </w:r>
+    </w:p>
+    <w:p>
+      <w:pPr>
         <w:pStyle w:val="ListParagraph"/>
         <w:numPr>
           <w:ilvl w:val="0"/>
@@ -882,6 +896,20 @@
     </w:p>
     <w:p>
       <w:pPr>
+        <w:spacing w:after="14" w:before="0"/>
+      </w:pPr>
+      <w:r>
+        <w:rPr>
+          <w:rFonts w:ascii="Calibri" w:cs="Calibri" w:eastAsia="Calibri" w:hAnsi="Calibri"/>
+          <w:color w:val="3a3a3a"/>
+          <w:sz w:val="19"/>
+          <w:szCs w:val="19"/>
+        </w:rPr>
+        <w:t xml:space="preserve">A Python-powered recon toolkit that automates the early stages of a pentest — scans ports, fingerprints services, and assembles a structured threat report in a single run.</w:t>
+      </w:r>
+    </w:p>
+    <w:p>
+      <w:pPr>
         <w:pStyle w:val="ListParagraph"/>
         <w:numPr>
           <w:ilvl w:val="0"/>
@@ -933,6 +961,20 @@
     </w:p>
     <w:p>
       <w:pPr>
+        <w:spacing w:after="14" w:before="0"/>
+      </w:pPr>
+      <w:r>
+        <w:rPr>
+          <w:rFonts w:ascii="Calibri" w:cs="Calibri" w:eastAsia="Calibri" w:hAnsi="Calibri"/>
+          <w:color w:val="3a3a3a"/>
+          <w:sz w:val="19"/>
+          <w:szCs w:val="19"/>
+        </w:rPr>
+        <w:t xml:space="preserve">Point it at a target and it systematically checks for the most common web vulnerabilities across the OWASP Top 10, then generates a detailed remediation report — no manual probing needed.</w:t>
+      </w:r>
+    </w:p>
+    <w:p>
+      <w:pPr>
         <w:pStyle w:val="ListParagraph"/>
         <w:numPr>
           <w:ilvl w:val="0"/>
@@ -984,6 +1026,20 @@
     </w:p>
     <w:p>
       <w:pPr>
+        <w:spacing w:after="14" w:before="0"/>
+      </w:pPr>
+      <w:r>
+        <w:rPr>
+          <w:rFonts w:ascii="Calibri" w:cs="Calibri" w:eastAsia="Calibri" w:hAnsi="Calibri"/>
+          <w:color w:val="3a3a3a"/>
+          <w:sz w:val="19"/>
+          <w:szCs w:val="19"/>
+        </w:rPr>
+        <w:t xml:space="preserve">A sales automation tool packaged as a standalone .exe that scrapes job boards and company pages to extract validated leads — built to cut manual prospecting time to near zero.</w:t>
+      </w:r>
+    </w:p>
+    <w:p>
+      <w:pPr>
         <w:pStyle w:val="ListParagraph"/>
         <w:numPr>
           <w:ilvl w:val="0"/>
@@ -1031,6 +1087,20 @@
           <w:szCs w:val="17"/>
         </w:rPr>
         <w:t xml:space="preserve">Flask · MySQL · QR Code · OTP · Python</w:t>
+      </w:r>
+    </w:p>
+    <w:p>
+      <w:pPr>
+        <w:spacing w:after="14" w:before="0"/>
+      </w:pPr>
+      <w:r>
+        <w:rPr>
+          <w:rFonts w:ascii="Calibri" w:cs="Calibri" w:eastAsia="Calibri" w:hAnsi="Calibri"/>
+          <w:color w:val="3a3a3a"/>
+          <w:sz w:val="19"/>
+          <w:szCs w:val="19"/>
+        </w:rPr>
+        <w:t xml:space="preserve">Built to close the proxy attendance loophole: students must scan a time-limited QR code and verify a one-time PIN before attendance is logged, making impersonation practically impossible.</w:t>
       </w:r>
     </w:p>
     <w:p>

</xml_diff>

<commit_message>
fix: update MPC school location from Visakhapatnam to Bhubaneswar in resume
</commit_message>
<xml_diff>
--- a/public/Abhiram_Lanka_Resume.docx
+++ b/public/Abhiram_Lanka_Resume.docx
@@ -1,5 +1,5 @@
 
-<file path=word/document.xml><?xml version="1.0" encoding="utf-8"?>
+<file path=word\document.xml><?xml version="1.0" encoding="utf-8"?>
 <w:document xmlns:mc="http://schemas.openxmlformats.org/markup-compatibility/2006" xmlns:o="urn:schemas-microsoft-com:office:office" xmlns:r="http://schemas.openxmlformats.org/officeDocument/2006/relationships" xmlns:m="http://schemas.openxmlformats.org/officeDocument/2006/math" xmlns:v="urn:schemas-microsoft-com:vml" xmlns:wp="http://schemas.openxmlformats.org/drawingml/2006/wordprocessingDrawing" xmlns:w10="urn:schemas-microsoft-com:office:word" xmlns:w="http://schemas.openxmlformats.org/wordprocessingml/2006/main" xmlns:wne="http://schemas.microsoft.com/office/word/2006/wordml" xmlns:sl="http://schemas.openxmlformats.org/schemaLibrary/2006/main" xmlns:a="http://schemas.openxmlformats.org/drawingml/2006/main" xmlns:pic="http://schemas.openxmlformats.org/drawingml/2006/picture" xmlns:c="http://schemas.openxmlformats.org/drawingml/2006/chart" xmlns:lc="http://schemas.openxmlformats.org/drawingml/2006/lockedCanvas" xmlns:dgm="http://schemas.openxmlformats.org/drawingml/2006/diagram" xmlns:wps="http://schemas.microsoft.com/office/word/2010/wordprocessingShape" xmlns:wpg="http://schemas.microsoft.com/office/word/2010/wordprocessingGroup" xmlns:w14="http://schemas.microsoft.com/office/word/2010/wordml" xmlns:w15="http://schemas.microsoft.com/office/word/2012/wordml" xmlns:w16="http://schemas.microsoft.com/office/word/2018/wordml" xmlns:w16cex="http://schemas.microsoft.com/office/word/2018/wordml/cex" xmlns:w16cid="http://schemas.microsoft.com/office/word/2016/wordml/cid" xmlns="http://schemas.microsoft.com/office/tasks/2019/documenttasks" xmlns:cr="http://schemas.microsoft.com/office/comments/2020/reactions">
   <w:body>
     <w:p>
@@ -2323,7 +2323,7 @@
           <w:szCs w:val="19"/>
           <w:rtl w:val="0"/>
         </w:rPr>
-        <w:t xml:space="preserve">St. Xavier International School, Visakhapatnam</w:t>
+        <w:t xml:space="preserve">St. Xavier International School, Bhubaneswar</w:t>
       </w:r>
       <w:r>
         <w:rPr>
@@ -2607,7 +2607,14 @@
 </w:document>
 </file>
 
-<file path=word/footer1.xml><?xml version="1.0" encoding="utf-8"?>
+<file path=word\fontTable.xml><?xml version="1.0" encoding="utf-8"?>
+<w:fonts xmlns:mc="http://schemas.openxmlformats.org/markup-compatibility/2006" xmlns:o="urn:schemas-microsoft-com:office:office" xmlns:r="http://schemas.openxmlformats.org/officeDocument/2006/relationships" xmlns:m="http://schemas.openxmlformats.org/officeDocument/2006/math" xmlns:v="urn:schemas-microsoft-com:vml" xmlns:wp="http://schemas.openxmlformats.org/drawingml/2006/wordprocessingDrawing" xmlns:w10="urn:schemas-microsoft-com:office:word" xmlns:w="http://schemas.openxmlformats.org/wordprocessingml/2006/main" xmlns:wne="http://schemas.microsoft.com/office/word/2006/wordml" xmlns:sl="http://schemas.openxmlformats.org/schemaLibrary/2006/main" xmlns:a="http://schemas.openxmlformats.org/drawingml/2006/main" xmlns:pic="http://schemas.openxmlformats.org/drawingml/2006/picture" xmlns:c="http://schemas.openxmlformats.org/drawingml/2006/chart" xmlns:lc="http://schemas.openxmlformats.org/drawingml/2006/lockedCanvas" xmlns:dgm="http://schemas.openxmlformats.org/drawingml/2006/diagram" xmlns:wps="http://schemas.microsoft.com/office/word/2010/wordprocessingShape" xmlns:wpg="http://schemas.microsoft.com/office/word/2010/wordprocessingGroup" xmlns:w14="http://schemas.microsoft.com/office/word/2010/wordml" xmlns:w15="http://schemas.microsoft.com/office/word/2012/wordml" xmlns:w16="http://schemas.microsoft.com/office/word/2018/wordml" xmlns:w16cex="http://schemas.microsoft.com/office/word/2018/wordml/cex" xmlns:w16cid="http://schemas.microsoft.com/office/word/2016/wordml/cid" xmlns="http://schemas.microsoft.com/office/tasks/2019/documenttasks" xmlns:cr="http://schemas.microsoft.com/office/comments/2020/reactions">
+  <w:font w:name="Calibri"/>
+  <w:font w:name="Georgia"/>
+</w:fonts>
+</file>
+
+<file path=word\footer1.xml><?xml version="1.0" encoding="utf-8"?>
 <w:ftr xmlns:mc="http://schemas.openxmlformats.org/markup-compatibility/2006" xmlns:o="urn:schemas-microsoft-com:office:office" xmlns:r="http://schemas.openxmlformats.org/officeDocument/2006/relationships" xmlns:m="http://schemas.openxmlformats.org/officeDocument/2006/math" xmlns:v="urn:schemas-microsoft-com:vml" xmlns:wp="http://schemas.openxmlformats.org/drawingml/2006/wordprocessingDrawing" xmlns:w10="urn:schemas-microsoft-com:office:word" xmlns:w="http://schemas.openxmlformats.org/wordprocessingml/2006/main" xmlns:wne="http://schemas.microsoft.com/office/word/2006/wordml" xmlns:sl="http://schemas.openxmlformats.org/schemaLibrary/2006/main" xmlns:a="http://schemas.openxmlformats.org/drawingml/2006/main" xmlns:pic="http://schemas.openxmlformats.org/drawingml/2006/picture" xmlns:c="http://schemas.openxmlformats.org/drawingml/2006/chart" xmlns:lc="http://schemas.openxmlformats.org/drawingml/2006/lockedCanvas" xmlns:dgm="http://schemas.openxmlformats.org/drawingml/2006/diagram" xmlns:wps="http://schemas.microsoft.com/office/word/2010/wordprocessingShape" xmlns:wpg="http://schemas.microsoft.com/office/word/2010/wordprocessingGroup" xmlns:w14="http://schemas.microsoft.com/office/word/2010/wordml" xmlns:w15="http://schemas.microsoft.com/office/word/2012/wordml" xmlns:w16="http://schemas.microsoft.com/office/word/2018/wordml" xmlns:w16cex="http://schemas.microsoft.com/office/word/2018/wordml/cex" xmlns:w16cid="http://schemas.microsoft.com/office/word/2016/wordml/cid" xmlns="http://schemas.microsoft.com/office/tasks/2019/documenttasks" xmlns:cr="http://schemas.microsoft.com/office/comments/2020/reactions">
   <w:p>
     <w:pPr>
@@ -2632,7 +2639,7 @@
 </w:ftr>
 </file>
 
-<file path=word/numbering.xml><?xml version="1.0" encoding="utf-8"?>
+<file path=word\numbering.xml><?xml version="1.0" encoding="utf-8"?>
 <w:numbering xmlns:mc="http://schemas.openxmlformats.org/markup-compatibility/2006" xmlns:o="urn:schemas-microsoft-com:office:office" xmlns:r="http://schemas.openxmlformats.org/officeDocument/2006/relationships" xmlns:m="http://schemas.openxmlformats.org/officeDocument/2006/math" xmlns:v="urn:schemas-microsoft-com:vml" xmlns:wp="http://schemas.openxmlformats.org/drawingml/2006/wordprocessingDrawing" xmlns:w10="urn:schemas-microsoft-com:office:word" xmlns:w="http://schemas.openxmlformats.org/wordprocessingml/2006/main" xmlns:wne="http://schemas.microsoft.com/office/word/2006/wordml" xmlns:sl="http://schemas.openxmlformats.org/schemaLibrary/2006/main" xmlns:a="http://schemas.openxmlformats.org/drawingml/2006/main" xmlns:pic="http://schemas.openxmlformats.org/drawingml/2006/picture" xmlns:c="http://schemas.openxmlformats.org/drawingml/2006/chart" xmlns:lc="http://schemas.openxmlformats.org/drawingml/2006/lockedCanvas" xmlns:dgm="http://schemas.openxmlformats.org/drawingml/2006/diagram" xmlns:wps="http://schemas.microsoft.com/office/word/2010/wordprocessingShape" xmlns:wpg="http://schemas.microsoft.com/office/word/2010/wordprocessingGroup" xmlns:w14="http://schemas.microsoft.com/office/word/2010/wordml" xmlns:w15="http://schemas.microsoft.com/office/word/2012/wordml" xmlns:w16="http://schemas.microsoft.com/office/word/2018/wordml" xmlns:w16cex="http://schemas.microsoft.com/office/word/2018/wordml/cex" xmlns:w16cid="http://schemas.microsoft.com/office/word/2016/wordml/cid" xmlns="http://schemas.microsoft.com/office/tasks/2019/documenttasks" xmlns:cr="http://schemas.microsoft.com/office/comments/2020/reactions">
   <w:abstractNum w:abstractNumId="1">
     <w:lvl w:ilvl="0">
@@ -2732,7 +2739,18 @@
 </w:numbering>
 </file>
 
-<file path=word/styles.xml><?xml version="1.0" encoding="utf-8"?>
+<file path=word\settings.xml><?xml version="1.0" encoding="utf-8"?>
+<w:settings xmlns:mc="http://schemas.openxmlformats.org/markup-compatibility/2006" xmlns:o="urn:schemas-microsoft-com:office:office" xmlns:r="http://schemas.openxmlformats.org/officeDocument/2006/relationships" xmlns:m="http://schemas.openxmlformats.org/officeDocument/2006/math" xmlns:v="urn:schemas-microsoft-com:vml" xmlns:wp="http://schemas.openxmlformats.org/drawingml/2006/wordprocessingDrawing" xmlns:w10="urn:schemas-microsoft-com:office:word" xmlns:w="http://schemas.openxmlformats.org/wordprocessingml/2006/main" xmlns:wne="http://schemas.microsoft.com/office/word/2006/wordml" xmlns:sl="http://schemas.openxmlformats.org/schemaLibrary/2006/main" xmlns:a="http://schemas.openxmlformats.org/drawingml/2006/main" xmlns:pic="http://schemas.openxmlformats.org/drawingml/2006/picture" xmlns:c="http://schemas.openxmlformats.org/drawingml/2006/chart" xmlns:lc="http://schemas.openxmlformats.org/drawingml/2006/lockedCanvas" xmlns:dgm="http://schemas.openxmlformats.org/drawingml/2006/diagram" xmlns:wps="http://schemas.microsoft.com/office/word/2010/wordprocessingShape" xmlns:wpg="http://schemas.microsoft.com/office/word/2010/wordprocessingGroup" xmlns:w14="http://schemas.microsoft.com/office/word/2010/wordml" xmlns:w15="http://schemas.microsoft.com/office/word/2012/wordml" xmlns:w16="http://schemas.microsoft.com/office/word/2018/wordml" xmlns:w16cex="http://schemas.microsoft.com/office/word/2018/wordml/cex" xmlns:w16cid="http://schemas.microsoft.com/office/word/2016/wordml/cid" xmlns="http://schemas.microsoft.com/office/tasks/2019/documenttasks" xmlns:cr="http://schemas.microsoft.com/office/comments/2020/reactions">
+  <w:embedTrueTypeFonts w:val="1"/>
+  <w:defaultTabStop w:val="720"/>
+  <w:compat>
+    <w:compatSetting w:val="15" w:name="compatibilityMode" w:uri="http://schemas.microsoft.com/office/word"/>
+  </w:compat>
+  <w:clrSchemeMapping w:bg1="light1" w:t1="dark1" w:bg2="light2" w:t2="dark2" w:accent1="accent1" w:accent2="accent2" w:accent3="accent3" w:accent4="accent4" w:accent5="accent5" w:accent6="accent6" w:hyperlink="hyperlink" w:followedHyperlink="followedHyperlink"/>
+</w:settings>
+</file>
+
+<file path=word\styles.xml><?xml version="1.0" encoding="utf-8"?>
 <w:styles xmlns:mc="http://schemas.openxmlformats.org/markup-compatibility/2006" xmlns:o="urn:schemas-microsoft-com:office:office" xmlns:r="http://schemas.openxmlformats.org/officeDocument/2006/relationships" xmlns:m="http://schemas.openxmlformats.org/officeDocument/2006/math" xmlns:v="urn:schemas-microsoft-com:vml" xmlns:wp="http://schemas.openxmlformats.org/drawingml/2006/wordprocessingDrawing" xmlns:w10="urn:schemas-microsoft-com:office:word" xmlns:w="http://schemas.openxmlformats.org/wordprocessingml/2006/main" xmlns:wne="http://schemas.microsoft.com/office/word/2006/wordml" xmlns:sl="http://schemas.openxmlformats.org/schemaLibrary/2006/main" xmlns:a="http://schemas.openxmlformats.org/drawingml/2006/main" xmlns:pic="http://schemas.openxmlformats.org/drawingml/2006/picture" xmlns:c="http://schemas.openxmlformats.org/drawingml/2006/chart" xmlns:lc="http://schemas.openxmlformats.org/drawingml/2006/lockedCanvas" xmlns:dgm="http://schemas.openxmlformats.org/drawingml/2006/diagram" xmlns:wps="http://schemas.microsoft.com/office/word/2010/wordprocessingShape" xmlns:wpg="http://schemas.microsoft.com/office/word/2010/wordprocessingGroup" xmlns:w14="http://schemas.microsoft.com/office/word/2010/wordml" xmlns:w15="http://schemas.microsoft.com/office/word/2012/wordml" xmlns:w16="http://schemas.microsoft.com/office/word/2018/wordml" xmlns:w16cex="http://schemas.microsoft.com/office/word/2018/wordml/cex" xmlns:w16cid="http://schemas.microsoft.com/office/word/2016/wordml/cid" xmlns="http://schemas.microsoft.com/office/tasks/2019/documenttasks" xmlns:cr="http://schemas.microsoft.com/office/comments/2020/reactions">
   <w:docDefaults>
     <w:rPrDefault>
@@ -3041,7 +3059,7 @@
 </w:styles>
 </file>
 
-<file path=word/theme/theme1.xml><?xml version="1.0" encoding="utf-8"?>
+<file path=word\theme\theme1.xml><?xml version="1.0" encoding="utf-8"?>
 <a:theme xmlns:a="http://schemas.openxmlformats.org/drawingml/2006/main" name="Office Theme">
   <a:themeElements>
     <a:clrScheme name="Office">

</xml_diff>

<commit_message>
fix: correct MPC school location to Bhubaneswar, properly repacked docx
</commit_message>
<xml_diff>
--- a/public/Abhiram_Lanka_Resume.docx
+++ b/public/Abhiram_Lanka_Resume.docx
@@ -1,5 +1,5 @@
 
-<file path=word\document.xml><?xml version="1.0" encoding="utf-8"?>
+<file path=word/document.xml><?xml version="1.0" encoding="utf-8"?>
 <w:document xmlns:mc="http://schemas.openxmlformats.org/markup-compatibility/2006" xmlns:o="urn:schemas-microsoft-com:office:office" xmlns:r="http://schemas.openxmlformats.org/officeDocument/2006/relationships" xmlns:m="http://schemas.openxmlformats.org/officeDocument/2006/math" xmlns:v="urn:schemas-microsoft-com:vml" xmlns:wp="http://schemas.openxmlformats.org/drawingml/2006/wordprocessingDrawing" xmlns:w10="urn:schemas-microsoft-com:office:word" xmlns:w="http://schemas.openxmlformats.org/wordprocessingml/2006/main" xmlns:wne="http://schemas.microsoft.com/office/word/2006/wordml" xmlns:sl="http://schemas.openxmlformats.org/schemaLibrary/2006/main" xmlns:a="http://schemas.openxmlformats.org/drawingml/2006/main" xmlns:pic="http://schemas.openxmlformats.org/drawingml/2006/picture" xmlns:c="http://schemas.openxmlformats.org/drawingml/2006/chart" xmlns:lc="http://schemas.openxmlformats.org/drawingml/2006/lockedCanvas" xmlns:dgm="http://schemas.openxmlformats.org/drawingml/2006/diagram" xmlns:wps="http://schemas.microsoft.com/office/word/2010/wordprocessingShape" xmlns:wpg="http://schemas.microsoft.com/office/word/2010/wordprocessingGroup" xmlns:w14="http://schemas.microsoft.com/office/word/2010/wordml" xmlns:w15="http://schemas.microsoft.com/office/word/2012/wordml" xmlns:w16="http://schemas.microsoft.com/office/word/2018/wordml" xmlns:w16cex="http://schemas.microsoft.com/office/word/2018/wordml/cex" xmlns:w16cid="http://schemas.microsoft.com/office/word/2016/wordml/cid" xmlns="http://schemas.microsoft.com/office/tasks/2019/documenttasks" xmlns:cr="http://schemas.microsoft.com/office/comments/2020/reactions">
   <w:body>
     <w:p>
@@ -2607,14 +2607,7 @@
 </w:document>
 </file>
 
-<file path=word\fontTable.xml><?xml version="1.0" encoding="utf-8"?>
-<w:fonts xmlns:mc="http://schemas.openxmlformats.org/markup-compatibility/2006" xmlns:o="urn:schemas-microsoft-com:office:office" xmlns:r="http://schemas.openxmlformats.org/officeDocument/2006/relationships" xmlns:m="http://schemas.openxmlformats.org/officeDocument/2006/math" xmlns:v="urn:schemas-microsoft-com:vml" xmlns:wp="http://schemas.openxmlformats.org/drawingml/2006/wordprocessingDrawing" xmlns:w10="urn:schemas-microsoft-com:office:word" xmlns:w="http://schemas.openxmlformats.org/wordprocessingml/2006/main" xmlns:wne="http://schemas.microsoft.com/office/word/2006/wordml" xmlns:sl="http://schemas.openxmlformats.org/schemaLibrary/2006/main" xmlns:a="http://schemas.openxmlformats.org/drawingml/2006/main" xmlns:pic="http://schemas.openxmlformats.org/drawingml/2006/picture" xmlns:c="http://schemas.openxmlformats.org/drawingml/2006/chart" xmlns:lc="http://schemas.openxmlformats.org/drawingml/2006/lockedCanvas" xmlns:dgm="http://schemas.openxmlformats.org/drawingml/2006/diagram" xmlns:wps="http://schemas.microsoft.com/office/word/2010/wordprocessingShape" xmlns:wpg="http://schemas.microsoft.com/office/word/2010/wordprocessingGroup" xmlns:w14="http://schemas.microsoft.com/office/word/2010/wordml" xmlns:w15="http://schemas.microsoft.com/office/word/2012/wordml" xmlns:w16="http://schemas.microsoft.com/office/word/2018/wordml" xmlns:w16cex="http://schemas.microsoft.com/office/word/2018/wordml/cex" xmlns:w16cid="http://schemas.microsoft.com/office/word/2016/wordml/cid" xmlns="http://schemas.microsoft.com/office/tasks/2019/documenttasks" xmlns:cr="http://schemas.microsoft.com/office/comments/2020/reactions">
-  <w:font w:name="Calibri"/>
-  <w:font w:name="Georgia"/>
-</w:fonts>
-</file>
-
-<file path=word\footer1.xml><?xml version="1.0" encoding="utf-8"?>
+<file path=word/footer1.xml><?xml version="1.0" encoding="utf-8"?>
 <w:ftr xmlns:mc="http://schemas.openxmlformats.org/markup-compatibility/2006" xmlns:o="urn:schemas-microsoft-com:office:office" xmlns:r="http://schemas.openxmlformats.org/officeDocument/2006/relationships" xmlns:m="http://schemas.openxmlformats.org/officeDocument/2006/math" xmlns:v="urn:schemas-microsoft-com:vml" xmlns:wp="http://schemas.openxmlformats.org/drawingml/2006/wordprocessingDrawing" xmlns:w10="urn:schemas-microsoft-com:office:word" xmlns:w="http://schemas.openxmlformats.org/wordprocessingml/2006/main" xmlns:wne="http://schemas.microsoft.com/office/word/2006/wordml" xmlns:sl="http://schemas.openxmlformats.org/schemaLibrary/2006/main" xmlns:a="http://schemas.openxmlformats.org/drawingml/2006/main" xmlns:pic="http://schemas.openxmlformats.org/drawingml/2006/picture" xmlns:c="http://schemas.openxmlformats.org/drawingml/2006/chart" xmlns:lc="http://schemas.openxmlformats.org/drawingml/2006/lockedCanvas" xmlns:dgm="http://schemas.openxmlformats.org/drawingml/2006/diagram" xmlns:wps="http://schemas.microsoft.com/office/word/2010/wordprocessingShape" xmlns:wpg="http://schemas.microsoft.com/office/word/2010/wordprocessingGroup" xmlns:w14="http://schemas.microsoft.com/office/word/2010/wordml" xmlns:w15="http://schemas.microsoft.com/office/word/2012/wordml" xmlns:w16="http://schemas.microsoft.com/office/word/2018/wordml" xmlns:w16cex="http://schemas.microsoft.com/office/word/2018/wordml/cex" xmlns:w16cid="http://schemas.microsoft.com/office/word/2016/wordml/cid" xmlns="http://schemas.microsoft.com/office/tasks/2019/documenttasks" xmlns:cr="http://schemas.microsoft.com/office/comments/2020/reactions">
   <w:p>
     <w:pPr>
@@ -2639,7 +2632,7 @@
 </w:ftr>
 </file>
 
-<file path=word\numbering.xml><?xml version="1.0" encoding="utf-8"?>
+<file path=word/numbering.xml><?xml version="1.0" encoding="utf-8"?>
 <w:numbering xmlns:mc="http://schemas.openxmlformats.org/markup-compatibility/2006" xmlns:o="urn:schemas-microsoft-com:office:office" xmlns:r="http://schemas.openxmlformats.org/officeDocument/2006/relationships" xmlns:m="http://schemas.openxmlformats.org/officeDocument/2006/math" xmlns:v="urn:schemas-microsoft-com:vml" xmlns:wp="http://schemas.openxmlformats.org/drawingml/2006/wordprocessingDrawing" xmlns:w10="urn:schemas-microsoft-com:office:word" xmlns:w="http://schemas.openxmlformats.org/wordprocessingml/2006/main" xmlns:wne="http://schemas.microsoft.com/office/word/2006/wordml" xmlns:sl="http://schemas.openxmlformats.org/schemaLibrary/2006/main" xmlns:a="http://schemas.openxmlformats.org/drawingml/2006/main" xmlns:pic="http://schemas.openxmlformats.org/drawingml/2006/picture" xmlns:c="http://schemas.openxmlformats.org/drawingml/2006/chart" xmlns:lc="http://schemas.openxmlformats.org/drawingml/2006/lockedCanvas" xmlns:dgm="http://schemas.openxmlformats.org/drawingml/2006/diagram" xmlns:wps="http://schemas.microsoft.com/office/word/2010/wordprocessingShape" xmlns:wpg="http://schemas.microsoft.com/office/word/2010/wordprocessingGroup" xmlns:w14="http://schemas.microsoft.com/office/word/2010/wordml" xmlns:w15="http://schemas.microsoft.com/office/word/2012/wordml" xmlns:w16="http://schemas.microsoft.com/office/word/2018/wordml" xmlns:w16cex="http://schemas.microsoft.com/office/word/2018/wordml/cex" xmlns:w16cid="http://schemas.microsoft.com/office/word/2016/wordml/cid" xmlns="http://schemas.microsoft.com/office/tasks/2019/documenttasks" xmlns:cr="http://schemas.microsoft.com/office/comments/2020/reactions">
   <w:abstractNum w:abstractNumId="1">
     <w:lvl w:ilvl="0">
@@ -2739,18 +2732,7 @@
 </w:numbering>
 </file>
 
-<file path=word\settings.xml><?xml version="1.0" encoding="utf-8"?>
-<w:settings xmlns:mc="http://schemas.openxmlformats.org/markup-compatibility/2006" xmlns:o="urn:schemas-microsoft-com:office:office" xmlns:r="http://schemas.openxmlformats.org/officeDocument/2006/relationships" xmlns:m="http://schemas.openxmlformats.org/officeDocument/2006/math" xmlns:v="urn:schemas-microsoft-com:vml" xmlns:wp="http://schemas.openxmlformats.org/drawingml/2006/wordprocessingDrawing" xmlns:w10="urn:schemas-microsoft-com:office:word" xmlns:w="http://schemas.openxmlformats.org/wordprocessingml/2006/main" xmlns:wne="http://schemas.microsoft.com/office/word/2006/wordml" xmlns:sl="http://schemas.openxmlformats.org/schemaLibrary/2006/main" xmlns:a="http://schemas.openxmlformats.org/drawingml/2006/main" xmlns:pic="http://schemas.openxmlformats.org/drawingml/2006/picture" xmlns:c="http://schemas.openxmlformats.org/drawingml/2006/chart" xmlns:lc="http://schemas.openxmlformats.org/drawingml/2006/lockedCanvas" xmlns:dgm="http://schemas.openxmlformats.org/drawingml/2006/diagram" xmlns:wps="http://schemas.microsoft.com/office/word/2010/wordprocessingShape" xmlns:wpg="http://schemas.microsoft.com/office/word/2010/wordprocessingGroup" xmlns:w14="http://schemas.microsoft.com/office/word/2010/wordml" xmlns:w15="http://schemas.microsoft.com/office/word/2012/wordml" xmlns:w16="http://schemas.microsoft.com/office/word/2018/wordml" xmlns:w16cex="http://schemas.microsoft.com/office/word/2018/wordml/cex" xmlns:w16cid="http://schemas.microsoft.com/office/word/2016/wordml/cid" xmlns="http://schemas.microsoft.com/office/tasks/2019/documenttasks" xmlns:cr="http://schemas.microsoft.com/office/comments/2020/reactions">
-  <w:embedTrueTypeFonts w:val="1"/>
-  <w:defaultTabStop w:val="720"/>
-  <w:compat>
-    <w:compatSetting w:val="15" w:name="compatibilityMode" w:uri="http://schemas.microsoft.com/office/word"/>
-  </w:compat>
-  <w:clrSchemeMapping w:bg1="light1" w:t1="dark1" w:bg2="light2" w:t2="dark2" w:accent1="accent1" w:accent2="accent2" w:accent3="accent3" w:accent4="accent4" w:accent5="accent5" w:accent6="accent6" w:hyperlink="hyperlink" w:followedHyperlink="followedHyperlink"/>
-</w:settings>
-</file>
-
-<file path=word\styles.xml><?xml version="1.0" encoding="utf-8"?>
+<file path=word/styles.xml><?xml version="1.0" encoding="utf-8"?>
 <w:styles xmlns:mc="http://schemas.openxmlformats.org/markup-compatibility/2006" xmlns:o="urn:schemas-microsoft-com:office:office" xmlns:r="http://schemas.openxmlformats.org/officeDocument/2006/relationships" xmlns:m="http://schemas.openxmlformats.org/officeDocument/2006/math" xmlns:v="urn:schemas-microsoft-com:vml" xmlns:wp="http://schemas.openxmlformats.org/drawingml/2006/wordprocessingDrawing" xmlns:w10="urn:schemas-microsoft-com:office:word" xmlns:w="http://schemas.openxmlformats.org/wordprocessingml/2006/main" xmlns:wne="http://schemas.microsoft.com/office/word/2006/wordml" xmlns:sl="http://schemas.openxmlformats.org/schemaLibrary/2006/main" xmlns:a="http://schemas.openxmlformats.org/drawingml/2006/main" xmlns:pic="http://schemas.openxmlformats.org/drawingml/2006/picture" xmlns:c="http://schemas.openxmlformats.org/drawingml/2006/chart" xmlns:lc="http://schemas.openxmlformats.org/drawingml/2006/lockedCanvas" xmlns:dgm="http://schemas.openxmlformats.org/drawingml/2006/diagram" xmlns:wps="http://schemas.microsoft.com/office/word/2010/wordprocessingShape" xmlns:wpg="http://schemas.microsoft.com/office/word/2010/wordprocessingGroup" xmlns:w14="http://schemas.microsoft.com/office/word/2010/wordml" xmlns:w15="http://schemas.microsoft.com/office/word/2012/wordml" xmlns:w16="http://schemas.microsoft.com/office/word/2018/wordml" xmlns:w16cex="http://schemas.microsoft.com/office/word/2018/wordml/cex" xmlns:w16cid="http://schemas.microsoft.com/office/word/2016/wordml/cid" xmlns="http://schemas.microsoft.com/office/tasks/2019/documenttasks" xmlns:cr="http://schemas.microsoft.com/office/comments/2020/reactions">
   <w:docDefaults>
     <w:rPrDefault>
@@ -3059,7 +3041,7 @@
 </w:styles>
 </file>
 
-<file path=word\theme\theme1.xml><?xml version="1.0" encoding="utf-8"?>
+<file path=word/theme/theme1.xml><?xml version="1.0" encoding="utf-8"?>
 <a:theme xmlns:a="http://schemas.openxmlformats.org/drawingml/2006/main" name="Office Theme">
   <a:themeElements>
     <a:clrScheme name="Office">

</xml_diff>